<commit_message>
Keep IEEESTEC figures with captions
</commit_message>
<xml_diff>
--- a/rad/ieeestec_jazzdialog_revidiran_v2.docx
+++ b/rad/ieeestec_jazzdialog_revidiran_v2.docx
@@ -276,6 +276,7 @@
     </w:p>
     <w:p>
       <w:pPr>
+        <w:keepNext/>
         <w:spacing w:before="40" w:after="20"/>
         <w:jc w:val="center"/>
       </w:pPr>
@@ -317,6 +318,7 @@
     <w:p>
       <w:pPr>
         <w:pStyle w:val="Caption"/>
+        <w:keepLines/>
         <w:spacing w:after="60" w:line="240" w:lineRule="auto"/>
         <w:jc w:val="both"/>
       </w:pPr>
@@ -335,6 +337,7 @@
     </w:p>
     <w:p>
       <w:pPr>
+        <w:keepNext/>
         <w:spacing w:before="40" w:after="20"/>
         <w:jc w:val="center"/>
       </w:pPr>
@@ -376,6 +379,7 @@
     <w:p>
       <w:pPr>
         <w:pStyle w:val="Caption"/>
+        <w:keepLines/>
         <w:spacing w:after="60" w:line="240" w:lineRule="auto"/>
         <w:jc w:val="both"/>
       </w:pPr>
@@ -403,6 +407,7 @@
     </w:p>
     <w:p>
       <w:pPr>
+        <w:keepNext/>
         <w:spacing w:before="40" w:after="20"/>
         <w:jc w:val="center"/>
       </w:pPr>
@@ -444,6 +449,7 @@
     <w:p>
       <w:pPr>
         <w:pStyle w:val="Caption"/>
+        <w:keepLines/>
         <w:spacing w:after="60" w:line="240" w:lineRule="auto"/>
         <w:jc w:val="both"/>
       </w:pPr>

</xml_diff>